<commit_message>
fix: update employment dates for accuracy in developer resume
</commit_message>
<xml_diff>
--- a/public/docs/andrew-magill-developer-resume.docx
+++ b/public/docs/andrew-magill-developer-resume.docx
@@ -196,12 +196,12 @@
             <wp:extent cx="6858000" cy="8466"/>
             <wp:effectExtent b="0" l="0" r="0" t="0"/>
             <wp:wrapNone/>
-            <wp:docPr id="1" name="image1.png"/>
+            <wp:docPr id="1" name="image4.png"/>
             <a:graphic>
               <a:graphicData uri="http://schemas.openxmlformats.org/drawingml/2006/picture">
                 <pic:pic>
                   <pic:nvPicPr>
-                    <pic:cNvPr id="0" name="image1.png"/>
+                    <pic:cNvPr id="0" name="image4.png"/>
                     <pic:cNvPicPr preferRelativeResize="0"/>
                   </pic:nvPicPr>
                   <pic:blipFill>
@@ -314,12 +314,12 @@
             <wp:extent cx="6858000" cy="8466"/>
             <wp:effectExtent b="0" l="0" r="0" t="0"/>
             <wp:wrapNone/>
-            <wp:docPr id="4" name="image2.png"/>
+            <wp:docPr id="4" name="image3.png"/>
             <a:graphic>
               <a:graphicData uri="http://schemas.openxmlformats.org/drawingml/2006/picture">
                 <pic:pic>
                   <pic:nvPicPr>
-                    <pic:cNvPr id="0" name="image2.png"/>
+                    <pic:cNvPr id="0" name="image3.png"/>
                     <pic:cNvPicPr preferRelativeResize="0"/>
                   </pic:nvPicPr>
                   <pic:blipFill>
@@ -595,12 +595,12 @@
             <wp:extent cx="6858000" cy="8466"/>
             <wp:effectExtent b="0" l="0" r="0" t="0"/>
             <wp:wrapNone/>
-            <wp:docPr id="3" name="image4.png"/>
+            <wp:docPr id="3" name="image2.png"/>
             <a:graphic>
               <a:graphicData uri="http://schemas.openxmlformats.org/drawingml/2006/picture">
                 <pic:pic>
                   <pic:nvPicPr>
-                    <pic:cNvPr id="0" name="image4.png"/>
+                    <pic:cNvPr id="0" name="image2.png"/>
                     <pic:cNvPicPr preferRelativeResize="0"/>
                   </pic:nvPicPr>
                   <pic:blipFill>
@@ -646,7 +646,17 @@
           <w:vertAlign w:val="baseline"/>
           <w:rtl w:val="0"/>
         </w:rPr>
-        <w:t xml:space="preserve">Metabolic Supply Group Apr 2026 - Present</w:t>
+        <w:t xml:space="preserve">Metabolic Supply Group Apr 2026 - </w:t>
+      </w:r>
+      <w:r>
+        <w:rPr>
+          <w:b w:val="1"/>
+          <w:bCs w:val="1"/>
+          <w:sz w:val="21"/>
+          <w:szCs w:val="21"/>
+          <w:rtl w:val="0"/>
+        </w:rPr>
+        <w:t xml:space="preserve">June 2026</w:t>
       </w:r>
       <w:r>
         <w:rPr>
@@ -2467,12 +2477,12 @@
             <wp:extent cx="6858000" cy="8467"/>
             <wp:effectExtent b="0" l="0" r="0" t="0"/>
             <wp:wrapNone/>
-            <wp:docPr id="2" name="image3.png"/>
+            <wp:docPr id="2" name="image1.png"/>
             <a:graphic>
               <a:graphicData uri="http://schemas.openxmlformats.org/drawingml/2006/picture">
                 <pic:pic>
                   <pic:nvPicPr>
-                    <pic:cNvPr id="0" name="image3.png"/>
+                    <pic:cNvPr id="0" name="image1.png"/>
                     <pic:cNvPicPr preferRelativeResize="0"/>
                   </pic:nvPicPr>
                   <pic:blipFill>

</xml_diff>